<commit_message>
Added API login route test results
</commit_message>
<xml_diff>
--- a/test results/capstone_test_results.docx
+++ b/test results/capstone_test_results.docx
@@ -9,6 +9,9 @@
     </w:p>
     <w:p>
       <w:r>
+        <w:rPr>
+          <w:noProof/>
+        </w:rPr>
         <w:drawing>
           <wp:inline distT="0" distB="0" distL="0" distR="0" wp14:anchorId="411151BF" wp14:editId="0E554815">
             <wp:extent cx="5943600" cy="3097530"/>
@@ -25,7 +28,7 @@
                     <pic:cNvPicPr/>
                   </pic:nvPicPr>
                   <pic:blipFill>
-                    <a:blip r:embed="rId5"/>
+                    <a:blip r:embed="rId7"/>
                     <a:stretch>
                       <a:fillRect/>
                     </a:stretch>
@@ -48,6 +51,9 @@
     </w:p>
     <w:p>
       <w:r>
+        <w:rPr>
+          <w:noProof/>
+        </w:rPr>
         <w:drawing>
           <wp:inline distT="0" distB="0" distL="0" distR="0" wp14:anchorId="02CB47F4" wp14:editId="090FB506">
             <wp:extent cx="5943600" cy="3114040"/>
@@ -64,7 +70,7 @@
                     <pic:cNvPicPr/>
                   </pic:nvPicPr>
                   <pic:blipFill>
-                    <a:blip r:embed="rId6"/>
+                    <a:blip r:embed="rId8"/>
                     <a:stretch>
                       <a:fillRect/>
                     </a:stretch>
@@ -91,35 +97,70 @@
     <w:p/>
     <w:p/>
     <w:p>
-      <w:r>
-        <w:lastRenderedPageBreak/>
-        <w:t xml:space="preserve">Postman </w:t>
-      </w:r>
-      <w:r>
-        <w:t>API Tests</w:t>
-      </w:r>
-      <w:r>
-        <w:t>:</w:t>
-      </w:r>
-    </w:p>
-    <w:p/>
-    <w:p>
       <w:pPr>
         <w:rPr>
           <w:b/>
           <w:bCs/>
+          <w:sz w:val="28"/>
+          <w:szCs w:val="28"/>
         </w:rPr>
       </w:pPr>
       <w:r>
         <w:rPr>
           <w:b/>
           <w:bCs/>
+          <w:sz w:val="28"/>
+          <w:szCs w:val="28"/>
         </w:rPr>
+        <w:lastRenderedPageBreak/>
+        <w:t xml:space="preserve">Postman </w:t>
+      </w:r>
+      <w:r>
+        <w:rPr>
+          <w:b/>
+          <w:bCs/>
+          <w:sz w:val="28"/>
+          <w:szCs w:val="28"/>
+        </w:rPr>
+        <w:t>API Tests</w:t>
+      </w:r>
+    </w:p>
+    <w:p>
+      <w:pPr>
+        <w:rPr>
+          <w:b/>
+          <w:bCs/>
+          <w:sz w:val="24"/>
+          <w:szCs w:val="24"/>
+        </w:rPr>
+      </w:pPr>
+      <w:r>
+        <w:rPr>
+          <w:b/>
+          <w:bCs/>
+          <w:sz w:val="24"/>
+          <w:szCs w:val="24"/>
+        </w:rPr>
+        <w:t>/api/auth/register:</w:t>
+      </w:r>
+    </w:p>
+    <w:p>
+      <w:pPr>
+        <w:pStyle w:val="ListParagraph"/>
+        <w:numPr>
+          <w:ilvl w:val="0"/>
+          <w:numId w:val="2"/>
+        </w:numPr>
+      </w:pPr>
+      <w:r>
         <w:t>Successful registration</w:t>
       </w:r>
     </w:p>
     <w:p>
       <w:r>
+        <w:rPr>
+          <w:noProof/>
+        </w:rPr>
         <w:drawing>
           <wp:inline distT="0" distB="0" distL="0" distR="0" wp14:anchorId="282E16D8" wp14:editId="0EF067B1">
             <wp:extent cx="5965190" cy="4078764"/>
@@ -136,7 +177,7 @@
                     <pic:cNvPicPr/>
                   </pic:nvPicPr>
                   <pic:blipFill>
-                    <a:blip r:embed="rId7"/>
+                    <a:blip r:embed="rId9"/>
                     <a:stretch>
                       <a:fillRect/>
                     </a:stretch>
@@ -158,12 +199,22 @@
       </w:r>
     </w:p>
     <w:p>
+      <w:pPr>
+        <w:pStyle w:val="ListParagraph"/>
+        <w:numPr>
+          <w:ilvl w:val="0"/>
+          <w:numId w:val="2"/>
+        </w:numPr>
+      </w:pPr>
       <w:r>
         <w:t>User created in DB</w:t>
       </w:r>
     </w:p>
     <w:p>
       <w:r>
+        <w:rPr>
+          <w:noProof/>
+        </w:rPr>
         <w:drawing>
           <wp:inline distT="0" distB="0" distL="0" distR="0" wp14:anchorId="266F7E8F" wp14:editId="0EEC6737">
             <wp:extent cx="5963182" cy="1174653"/>
@@ -180,7 +231,7 @@
                     <pic:cNvPicPr/>
                   </pic:nvPicPr>
                   <pic:blipFill rotWithShape="1">
-                    <a:blip r:embed="rId8"/>
+                    <a:blip r:embed="rId10"/>
                     <a:srcRect b="24062"/>
                     <a:stretch>
                       <a:fillRect/>
@@ -213,6 +264,9 @@
     <w:p/>
     <w:p>
       <w:r>
+        <w:rPr>
+          <w:noProof/>
+        </w:rPr>
         <w:drawing>
           <wp:inline distT="0" distB="0" distL="0" distR="0" wp14:anchorId="297480F9" wp14:editId="2381984F">
             <wp:extent cx="5943600" cy="1054735"/>
@@ -229,7 +283,7 @@
                     <pic:cNvPicPr/>
                   </pic:nvPicPr>
                   <pic:blipFill>
-                    <a:blip r:embed="rId9"/>
+                    <a:blip r:embed="rId11"/>
                     <a:stretch>
                       <a:fillRect/>
                     </a:stretch>
@@ -251,11 +305,14 @@
       </w:r>
     </w:p>
     <w:p>
-      <w:r>
-        <w:rPr>
-          <w:b/>
-          <w:bCs/>
-        </w:rPr>
+      <w:pPr>
+        <w:pStyle w:val="ListParagraph"/>
+        <w:numPr>
+          <w:ilvl w:val="0"/>
+          <w:numId w:val="2"/>
+        </w:numPr>
+      </w:pPr>
+      <w:r>
         <w:lastRenderedPageBreak/>
         <w:t>User already exists</w:t>
       </w:r>
@@ -267,6 +324,9 @@
         <w:br/>
       </w:r>
       <w:r>
+        <w:rPr>
+          <w:noProof/>
+        </w:rPr>
         <w:drawing>
           <wp:inline distT="0" distB="0" distL="0" distR="0" wp14:anchorId="443C1A6A" wp14:editId="4E3135FC">
             <wp:extent cx="5697415" cy="3190187"/>
@@ -283,7 +343,7 @@
                     <pic:cNvPicPr/>
                   </pic:nvPicPr>
                   <pic:blipFill>
-                    <a:blip r:embed="rId10"/>
+                    <a:blip r:embed="rId12"/>
                     <a:stretch>
                       <a:fillRect/>
                     </a:stretch>
@@ -306,17 +366,23 @@
     </w:p>
     <w:p/>
     <w:p>
+      <w:pPr>
+        <w:pStyle w:val="ListParagraph"/>
+        <w:numPr>
+          <w:ilvl w:val="0"/>
+          <w:numId w:val="2"/>
+        </w:numPr>
+      </w:pPr>
+      <w:r>
+        <w:t>Full name missing</w:t>
+      </w:r>
+      <w:r>
+        <w:br/>
+      </w:r>
       <w:r>
         <w:rPr>
-          <w:b/>
-          <w:bCs/>
+          <w:noProof/>
         </w:rPr>
-        <w:t>Full name missing</w:t>
-      </w:r>
-      <w:r>
-        <w:br/>
-      </w:r>
-      <w:r>
         <w:drawing>
           <wp:inline distT="0" distB="0" distL="0" distR="0" wp14:anchorId="229CCEAC" wp14:editId="15345855">
             <wp:extent cx="5795889" cy="3561127"/>
@@ -333,7 +399,7 @@
                     <pic:cNvPicPr/>
                   </pic:nvPicPr>
                   <pic:blipFill>
-                    <a:blip r:embed="rId11"/>
+                    <a:blip r:embed="rId13"/>
                     <a:stretch>
                       <a:fillRect/>
                     </a:stretch>
@@ -358,22 +424,22 @@
     <w:p/>
     <w:p>
       <w:pPr>
-        <w:rPr>
-          <w:b/>
-          <w:bCs/>
-        </w:rPr>
-      </w:pPr>
-      <w:r>
-        <w:rPr>
-          <w:b/>
-          <w:bCs/>
-        </w:rPr>
+        <w:pStyle w:val="ListParagraph"/>
+        <w:numPr>
+          <w:ilvl w:val="0"/>
+          <w:numId w:val="2"/>
+        </w:numPr>
+      </w:pPr>
+      <w:r>
         <w:lastRenderedPageBreak/>
         <w:t>First name missing</w:t>
       </w:r>
     </w:p>
     <w:p>
       <w:r>
+        <w:rPr>
+          <w:noProof/>
+        </w:rPr>
         <w:drawing>
           <wp:inline distT="0" distB="0" distL="0" distR="0" wp14:anchorId="53C63DB0" wp14:editId="372E95EC">
             <wp:extent cx="5472332" cy="3372852"/>
@@ -390,7 +456,7 @@
                     <pic:cNvPicPr/>
                   </pic:nvPicPr>
                   <pic:blipFill>
-                    <a:blip r:embed="rId12"/>
+                    <a:blip r:embed="rId14"/>
                     <a:stretch>
                       <a:fillRect/>
                     </a:stretch>
@@ -413,21 +479,21 @@
     </w:p>
     <w:p>
       <w:pPr>
+        <w:pStyle w:val="ListParagraph"/>
+        <w:numPr>
+          <w:ilvl w:val="0"/>
+          <w:numId w:val="2"/>
+        </w:numPr>
+      </w:pPr>
+      <w:r>
+        <w:t>Last name missing</w:t>
+      </w:r>
+    </w:p>
+    <w:p>
+      <w:r>
         <w:rPr>
-          <w:b/>
-          <w:bCs/>
+          <w:noProof/>
         </w:rPr>
-      </w:pPr>
-      <w:r>
-        <w:rPr>
-          <w:b/>
-          <w:bCs/>
-        </w:rPr>
-        <w:t>Last name missing</w:t>
-      </w:r>
-    </w:p>
-    <w:p>
-      <w:r>
         <w:drawing>
           <wp:inline distT="0" distB="0" distL="0" distR="0" wp14:anchorId="50684B8E" wp14:editId="40F3CDC5">
             <wp:extent cx="5598942" cy="3477803"/>
@@ -444,7 +510,7 @@
                     <pic:cNvPicPr/>
                   </pic:nvPicPr>
                   <pic:blipFill>
-                    <a:blip r:embed="rId13"/>
+                    <a:blip r:embed="rId15"/>
                     <a:stretch>
                       <a:fillRect/>
                     </a:stretch>
@@ -469,22 +535,22 @@
     <w:p/>
     <w:p>
       <w:pPr>
-        <w:rPr>
-          <w:b/>
-          <w:bCs/>
-        </w:rPr>
-      </w:pPr>
-      <w:r>
-        <w:rPr>
-          <w:b/>
-          <w:bCs/>
-        </w:rPr>
+        <w:pStyle w:val="ListParagraph"/>
+        <w:numPr>
+          <w:ilvl w:val="0"/>
+          <w:numId w:val="2"/>
+        </w:numPr>
+      </w:pPr>
+      <w:r>
         <w:lastRenderedPageBreak/>
         <w:t>Incorrect email format</w:t>
       </w:r>
     </w:p>
     <w:p>
       <w:r>
+        <w:rPr>
+          <w:noProof/>
+        </w:rPr>
         <w:drawing>
           <wp:inline distT="0" distB="0" distL="0" distR="0" wp14:anchorId="1F547304" wp14:editId="2C6E6070">
             <wp:extent cx="5669280" cy="3506353"/>
@@ -501,7 +567,7 @@
                     <pic:cNvPicPr/>
                   </pic:nvPicPr>
                   <pic:blipFill>
-                    <a:blip r:embed="rId14"/>
+                    <a:blip r:embed="rId16"/>
                     <a:stretch>
                       <a:fillRect/>
                     </a:stretch>
@@ -525,21 +591,21 @@
     <w:p/>
     <w:p>
       <w:pPr>
+        <w:pStyle w:val="ListParagraph"/>
+        <w:numPr>
+          <w:ilvl w:val="0"/>
+          <w:numId w:val="2"/>
+        </w:numPr>
+      </w:pPr>
+      <w:r>
+        <w:t>Password too short</w:t>
+      </w:r>
+    </w:p>
+    <w:p>
+      <w:r>
         <w:rPr>
-          <w:b/>
-          <w:bCs/>
+          <w:noProof/>
         </w:rPr>
-      </w:pPr>
-      <w:r>
-        <w:rPr>
-          <w:b/>
-          <w:bCs/>
-        </w:rPr>
-        <w:t>Password too short:</w:t>
-      </w:r>
-    </w:p>
-    <w:p>
-      <w:r>
         <w:drawing>
           <wp:inline distT="0" distB="0" distL="0" distR="0" wp14:anchorId="5743B5B5" wp14:editId="4600AC17">
             <wp:extent cx="5781822" cy="3585223"/>
@@ -556,7 +622,7 @@
                     <pic:cNvPicPr/>
                   </pic:nvPicPr>
                   <pic:blipFill>
-                    <a:blip r:embed="rId15"/>
+                    <a:blip r:embed="rId17"/>
                     <a:stretch>
                       <a:fillRect/>
                     </a:stretch>
@@ -579,6 +645,19 @@
     </w:p>
     <w:p>
       <w:pPr>
+        <w:pStyle w:val="ListParagraph"/>
+        <w:numPr>
+          <w:ilvl w:val="0"/>
+          <w:numId w:val="2"/>
+        </w:numPr>
+      </w:pPr>
+      <w:r>
+        <w:lastRenderedPageBreak/>
+        <w:t>Password too long</w:t>
+      </w:r>
+    </w:p>
+    <w:p>
+      <w:pPr>
         <w:rPr>
           <w:b/>
           <w:bCs/>
@@ -588,22 +667,7 @@
         <w:rPr>
           <w:b/>
           <w:bCs/>
-        </w:rPr>
-        <w:lastRenderedPageBreak/>
-        <w:t>Password too long:</w:t>
-      </w:r>
-    </w:p>
-    <w:p>
-      <w:pPr>
-        <w:rPr>
-          <w:b/>
-          <w:bCs/>
-        </w:rPr>
-      </w:pPr>
-      <w:r>
-        <w:rPr>
-          <w:b/>
-          <w:bCs/>
+          <w:noProof/>
         </w:rPr>
         <w:drawing>
           <wp:inline distT="0" distB="0" distL="0" distR="0" wp14:anchorId="5AABC29B" wp14:editId="03F15E90">
@@ -621,7 +685,7 @@
                     <pic:cNvPicPr/>
                   </pic:nvPicPr>
                   <pic:blipFill>
-                    <a:blip r:embed="rId16"/>
+                    <a:blip r:embed="rId18"/>
                     <a:stretch>
                       <a:fillRect/>
                     </a:stretch>
@@ -643,16 +707,22 @@
       </w:r>
     </w:p>
     <w:p>
+      <w:pPr>
+        <w:pStyle w:val="ListParagraph"/>
+        <w:numPr>
+          <w:ilvl w:val="0"/>
+          <w:numId w:val="2"/>
+        </w:numPr>
+      </w:pPr>
+      <w:r>
+        <w:t>Errors on every field at the same time</w:t>
+      </w:r>
+    </w:p>
+    <w:p>
       <w:r>
         <w:rPr>
-          <w:b/>
-          <w:bCs/>
+          <w:noProof/>
         </w:rPr>
-        <w:t>Errors on every field at the same time</w:t>
-      </w:r>
-    </w:p>
-    <w:p>
-      <w:r>
         <w:drawing>
           <wp:inline distT="0" distB="0" distL="0" distR="0" wp14:anchorId="18EE98F2" wp14:editId="56235481">
             <wp:extent cx="5943600" cy="3919855"/>
@@ -669,7 +739,7 @@
                     <pic:cNvPicPr/>
                   </pic:nvPicPr>
                   <pic:blipFill>
-                    <a:blip r:embed="rId17"/>
+                    <a:blip r:embed="rId19"/>
                     <a:stretch>
                       <a:fillRect/>
                     </a:stretch>
@@ -690,6 +760,764 @@
         </w:drawing>
       </w:r>
     </w:p>
+    <w:p>
+      <w:pPr>
+        <w:rPr>
+          <w:b/>
+          <w:bCs/>
+          <w:sz w:val="24"/>
+          <w:szCs w:val="24"/>
+        </w:rPr>
+      </w:pPr>
+      <w:r>
+        <w:rPr>
+          <w:b/>
+          <w:bCs/>
+          <w:sz w:val="24"/>
+          <w:szCs w:val="24"/>
+        </w:rPr>
+        <w:lastRenderedPageBreak/>
+        <w:t>/api/auth/login</w:t>
+      </w:r>
+    </w:p>
+    <w:p>
+      <w:pPr>
+        <w:pStyle w:val="ListParagraph"/>
+        <w:numPr>
+          <w:ilvl w:val="0"/>
+          <w:numId w:val="2"/>
+        </w:numPr>
+        <w:rPr>
+          <w:sz w:val="24"/>
+          <w:szCs w:val="24"/>
+        </w:rPr>
+      </w:pPr>
+      <w:r>
+        <w:rPr>
+          <w:sz w:val="24"/>
+          <w:szCs w:val="24"/>
+        </w:rPr>
+        <w:t>Successful login returns 200, user, and JWT token.</w:t>
+      </w:r>
+    </w:p>
+    <w:p>
+      <w:r>
+        <w:drawing>
+          <wp:inline distT="0" distB="0" distL="0" distR="0" wp14:anchorId="68292B4B" wp14:editId="7803994D">
+            <wp:extent cx="5943600" cy="4555490"/>
+            <wp:effectExtent l="0" t="0" r="0" b="0"/>
+            <wp:docPr id="1187827245" name="Picture 1"/>
+            <wp:cNvGraphicFramePr>
+              <a:graphicFrameLocks xmlns:a="http://schemas.openxmlformats.org/drawingml/2006/main" noChangeAspect="1"/>
+            </wp:cNvGraphicFramePr>
+            <a:graphic xmlns:a="http://schemas.openxmlformats.org/drawingml/2006/main">
+              <a:graphicData uri="http://schemas.openxmlformats.org/drawingml/2006/picture">
+                <pic:pic xmlns:pic="http://schemas.openxmlformats.org/drawingml/2006/picture">
+                  <pic:nvPicPr>
+                    <pic:cNvPr id="1187827245" name=""/>
+                    <pic:cNvPicPr/>
+                  </pic:nvPicPr>
+                  <pic:blipFill>
+                    <a:blip r:embed="rId20"/>
+                    <a:stretch>
+                      <a:fillRect/>
+                    </a:stretch>
+                  </pic:blipFill>
+                  <pic:spPr>
+                    <a:xfrm>
+                      <a:off x="0" y="0"/>
+                      <a:ext cx="5943600" cy="4555490"/>
+                    </a:xfrm>
+                    <a:prstGeom prst="rect">
+                      <a:avLst/>
+                    </a:prstGeom>
+                  </pic:spPr>
+                </pic:pic>
+              </a:graphicData>
+            </a:graphic>
+          </wp:inline>
+        </w:drawing>
+      </w:r>
+    </w:p>
+    <w:p/>
+    <w:p>
+      <w:pPr>
+        <w:pStyle w:val="ListParagraph"/>
+        <w:numPr>
+          <w:ilvl w:val="0"/>
+          <w:numId w:val="2"/>
+        </w:numPr>
+      </w:pPr>
+      <w:r>
+        <w:t xml:space="preserve">Empty password returns </w:t>
+      </w:r>
+      <w:r>
+        <w:t xml:space="preserve">400 </w:t>
+      </w:r>
+      <w:r>
+        <w:t>error</w:t>
+      </w:r>
+      <w:r>
+        <w:t>, message,</w:t>
+      </w:r>
+      <w:r>
+        <w:t xml:space="preserve"> and does not increase failed password count</w:t>
+      </w:r>
+    </w:p>
+    <w:p>
+      <w:pPr>
+        <w:ind w:left="360"/>
+      </w:pPr>
+      <w:r>
+        <w:drawing>
+          <wp:inline distT="0" distB="0" distL="0" distR="0" wp14:anchorId="3E5ED0D4" wp14:editId="42DF6309">
+            <wp:extent cx="5943600" cy="2217420"/>
+            <wp:effectExtent l="0" t="0" r="0" b="0"/>
+            <wp:docPr id="1657876728" name="Picture 1"/>
+            <wp:cNvGraphicFramePr>
+              <a:graphicFrameLocks xmlns:a="http://schemas.openxmlformats.org/drawingml/2006/main" noChangeAspect="1"/>
+            </wp:cNvGraphicFramePr>
+            <a:graphic xmlns:a="http://schemas.openxmlformats.org/drawingml/2006/main">
+              <a:graphicData uri="http://schemas.openxmlformats.org/drawingml/2006/picture">
+                <pic:pic xmlns:pic="http://schemas.openxmlformats.org/drawingml/2006/picture">
+                  <pic:nvPicPr>
+                    <pic:cNvPr id="1657876728" name=""/>
+                    <pic:cNvPicPr/>
+                  </pic:nvPicPr>
+                  <pic:blipFill>
+                    <a:blip r:embed="rId21"/>
+                    <a:stretch>
+                      <a:fillRect/>
+                    </a:stretch>
+                  </pic:blipFill>
+                  <pic:spPr>
+                    <a:xfrm>
+                      <a:off x="0" y="0"/>
+                      <a:ext cx="5943600" cy="2217420"/>
+                    </a:xfrm>
+                    <a:prstGeom prst="rect">
+                      <a:avLst/>
+                    </a:prstGeom>
+                  </pic:spPr>
+                </pic:pic>
+              </a:graphicData>
+            </a:graphic>
+          </wp:inline>
+        </w:drawing>
+      </w:r>
+    </w:p>
+    <w:p>
+      <w:pPr>
+        <w:ind w:left="360"/>
+      </w:pPr>
+      <w:r>
+        <w:lastRenderedPageBreak/>
+        <w:drawing>
+          <wp:anchor distT="0" distB="0" distL="114300" distR="114300" simplePos="0" relativeHeight="251659264" behindDoc="0" locked="0" layoutInCell="1" allowOverlap="1" wp14:anchorId="435EE072" wp14:editId="05978FA2">
+            <wp:simplePos x="0" y="0"/>
+            <wp:positionH relativeFrom="margin">
+              <wp:align>right</wp:align>
+            </wp:positionH>
+            <wp:positionV relativeFrom="paragraph">
+              <wp:posOffset>0</wp:posOffset>
+            </wp:positionV>
+            <wp:extent cx="1149350" cy="1114425"/>
+            <wp:effectExtent l="0" t="0" r="0" b="9525"/>
+            <wp:wrapThrough wrapText="bothSides">
+              <wp:wrapPolygon edited="0">
+                <wp:start x="0" y="0"/>
+                <wp:lineTo x="0" y="21415"/>
+                <wp:lineTo x="21123" y="21415"/>
+                <wp:lineTo x="21123" y="0"/>
+                <wp:lineTo x="0" y="0"/>
+              </wp:wrapPolygon>
+            </wp:wrapThrough>
+            <wp:docPr id="292449469" name="Picture 1"/>
+            <wp:cNvGraphicFramePr>
+              <a:graphicFrameLocks xmlns:a="http://schemas.openxmlformats.org/drawingml/2006/main" noChangeAspect="1"/>
+            </wp:cNvGraphicFramePr>
+            <a:graphic xmlns:a="http://schemas.openxmlformats.org/drawingml/2006/main">
+              <a:graphicData uri="http://schemas.openxmlformats.org/drawingml/2006/picture">
+                <pic:pic xmlns:pic="http://schemas.openxmlformats.org/drawingml/2006/picture">
+                  <pic:nvPicPr>
+                    <pic:cNvPr id="292449469" name=""/>
+                    <pic:cNvPicPr/>
+                  </pic:nvPicPr>
+                  <pic:blipFill>
+                    <a:blip r:embed="rId22">
+                      <a:extLst>
+                        <a:ext uri="{28A0092B-C50C-407E-A947-70E740481C1C}">
+                          <a14:useLocalDpi xmlns:a14="http://schemas.microsoft.com/office/drawing/2010/main" val="0"/>
+                        </a:ext>
+                      </a:extLst>
+                    </a:blip>
+                    <a:stretch>
+                      <a:fillRect/>
+                    </a:stretch>
+                  </pic:blipFill>
+                  <pic:spPr>
+                    <a:xfrm>
+                      <a:off x="0" y="0"/>
+                      <a:ext cx="1149350" cy="1114425"/>
+                    </a:xfrm>
+                    <a:prstGeom prst="rect">
+                      <a:avLst/>
+                    </a:prstGeom>
+                  </pic:spPr>
+                </pic:pic>
+              </a:graphicData>
+            </a:graphic>
+            <wp14:sizeRelH relativeFrom="page">
+              <wp14:pctWidth>0</wp14:pctWidth>
+            </wp14:sizeRelH>
+            <wp14:sizeRelV relativeFrom="page">
+              <wp14:pctHeight>0</wp14:pctHeight>
+            </wp14:sizeRelV>
+          </wp:anchor>
+        </w:drawing>
+      </w:r>
+      <w:r>
+        <w:drawing>
+          <wp:anchor distT="0" distB="0" distL="114300" distR="114300" simplePos="0" relativeHeight="251658240" behindDoc="1" locked="0" layoutInCell="1" allowOverlap="1" wp14:anchorId="47B12D2A" wp14:editId="392EEDF6">
+            <wp:simplePos x="0" y="0"/>
+            <wp:positionH relativeFrom="column">
+              <wp:posOffset>241300</wp:posOffset>
+            </wp:positionH>
+            <wp:positionV relativeFrom="paragraph">
+              <wp:posOffset>0</wp:posOffset>
+            </wp:positionV>
+            <wp:extent cx="4343623" cy="666784"/>
+            <wp:effectExtent l="0" t="0" r="0" b="0"/>
+            <wp:wrapTight wrapText="bothSides">
+              <wp:wrapPolygon edited="0">
+                <wp:start x="0" y="0"/>
+                <wp:lineTo x="0" y="20983"/>
+                <wp:lineTo x="21505" y="20983"/>
+                <wp:lineTo x="21505" y="0"/>
+                <wp:lineTo x="0" y="0"/>
+              </wp:wrapPolygon>
+            </wp:wrapTight>
+            <wp:docPr id="1628162430" name="Picture 1"/>
+            <wp:cNvGraphicFramePr>
+              <a:graphicFrameLocks xmlns:a="http://schemas.openxmlformats.org/drawingml/2006/main" noChangeAspect="1"/>
+            </wp:cNvGraphicFramePr>
+            <a:graphic xmlns:a="http://schemas.openxmlformats.org/drawingml/2006/main">
+              <a:graphicData uri="http://schemas.openxmlformats.org/drawingml/2006/picture">
+                <pic:pic xmlns:pic="http://schemas.openxmlformats.org/drawingml/2006/picture">
+                  <pic:nvPicPr>
+                    <pic:cNvPr id="1628162430" name=""/>
+                    <pic:cNvPicPr/>
+                  </pic:nvPicPr>
+                  <pic:blipFill>
+                    <a:blip r:embed="rId23">
+                      <a:extLst>
+                        <a:ext uri="{28A0092B-C50C-407E-A947-70E740481C1C}">
+                          <a14:useLocalDpi xmlns:a14="http://schemas.microsoft.com/office/drawing/2010/main" val="0"/>
+                        </a:ext>
+                      </a:extLst>
+                    </a:blip>
+                    <a:stretch>
+                      <a:fillRect/>
+                    </a:stretch>
+                  </pic:blipFill>
+                  <pic:spPr>
+                    <a:xfrm>
+                      <a:off x="0" y="0"/>
+                      <a:ext cx="4343623" cy="666784"/>
+                    </a:xfrm>
+                    <a:prstGeom prst="rect">
+                      <a:avLst/>
+                    </a:prstGeom>
+                  </pic:spPr>
+                </pic:pic>
+              </a:graphicData>
+            </a:graphic>
+          </wp:anchor>
+        </w:drawing>
+      </w:r>
+    </w:p>
+    <w:p/>
+    <w:p>
+      <w:pPr>
+        <w:pStyle w:val="ListParagraph"/>
+        <w:numPr>
+          <w:ilvl w:val="0"/>
+          <w:numId w:val="2"/>
+        </w:numPr>
+      </w:pPr>
+      <w:r>
+        <w:t>Empty email returns 400 error and message</w:t>
+      </w:r>
+    </w:p>
+    <w:p>
+      <w:r>
+        <w:drawing>
+          <wp:inline distT="0" distB="0" distL="0" distR="0" wp14:anchorId="684D6564" wp14:editId="699317DF">
+            <wp:extent cx="5943600" cy="3060065"/>
+            <wp:effectExtent l="0" t="0" r="0" b="6985"/>
+            <wp:docPr id="1810427960" name="Picture 1"/>
+            <wp:cNvGraphicFramePr>
+              <a:graphicFrameLocks xmlns:a="http://schemas.openxmlformats.org/drawingml/2006/main" noChangeAspect="1"/>
+            </wp:cNvGraphicFramePr>
+            <a:graphic xmlns:a="http://schemas.openxmlformats.org/drawingml/2006/main">
+              <a:graphicData uri="http://schemas.openxmlformats.org/drawingml/2006/picture">
+                <pic:pic xmlns:pic="http://schemas.openxmlformats.org/drawingml/2006/picture">
+                  <pic:nvPicPr>
+                    <pic:cNvPr id="1810427960" name=""/>
+                    <pic:cNvPicPr/>
+                  </pic:nvPicPr>
+                  <pic:blipFill>
+                    <a:blip r:embed="rId24"/>
+                    <a:stretch>
+                      <a:fillRect/>
+                    </a:stretch>
+                  </pic:blipFill>
+                  <pic:spPr>
+                    <a:xfrm>
+                      <a:off x="0" y="0"/>
+                      <a:ext cx="5943600" cy="3060065"/>
+                    </a:xfrm>
+                    <a:prstGeom prst="rect">
+                      <a:avLst/>
+                    </a:prstGeom>
+                  </pic:spPr>
+                </pic:pic>
+              </a:graphicData>
+            </a:graphic>
+          </wp:inline>
+        </w:drawing>
+      </w:r>
+    </w:p>
+    <w:p>
+      <w:pPr>
+        <w:pStyle w:val="ListParagraph"/>
+        <w:numPr>
+          <w:ilvl w:val="0"/>
+          <w:numId w:val="2"/>
+        </w:numPr>
+      </w:pPr>
+      <w:r>
+        <w:t>Email not found returns 401 error and message</w:t>
+      </w:r>
+    </w:p>
+    <w:p>
+      <w:r>
+        <w:drawing>
+          <wp:inline distT="0" distB="0" distL="0" distR="0" wp14:anchorId="2B7A70AB" wp14:editId="7B4DBF60">
+            <wp:extent cx="5943600" cy="3091180"/>
+            <wp:effectExtent l="0" t="0" r="0" b="0"/>
+            <wp:docPr id="299544504" name="Picture 1"/>
+            <wp:cNvGraphicFramePr>
+              <a:graphicFrameLocks xmlns:a="http://schemas.openxmlformats.org/drawingml/2006/main" noChangeAspect="1"/>
+            </wp:cNvGraphicFramePr>
+            <a:graphic xmlns:a="http://schemas.openxmlformats.org/drawingml/2006/main">
+              <a:graphicData uri="http://schemas.openxmlformats.org/drawingml/2006/picture">
+                <pic:pic xmlns:pic="http://schemas.openxmlformats.org/drawingml/2006/picture">
+                  <pic:nvPicPr>
+                    <pic:cNvPr id="299544504" name=""/>
+                    <pic:cNvPicPr/>
+                  </pic:nvPicPr>
+                  <pic:blipFill>
+                    <a:blip r:embed="rId25"/>
+                    <a:stretch>
+                      <a:fillRect/>
+                    </a:stretch>
+                  </pic:blipFill>
+                  <pic:spPr>
+                    <a:xfrm>
+                      <a:off x="0" y="0"/>
+                      <a:ext cx="5943600" cy="3091180"/>
+                    </a:xfrm>
+                    <a:prstGeom prst="rect">
+                      <a:avLst/>
+                    </a:prstGeom>
+                  </pic:spPr>
+                </pic:pic>
+              </a:graphicData>
+            </a:graphic>
+          </wp:inline>
+        </w:drawing>
+      </w:r>
+    </w:p>
+    <w:p>
+      <w:pPr>
+        <w:pStyle w:val="ListParagraph"/>
+        <w:numPr>
+          <w:ilvl w:val="0"/>
+          <w:numId w:val="2"/>
+        </w:numPr>
+      </w:pPr>
+      <w:r>
+        <w:lastRenderedPageBreak/>
+        <w:t>Inactive user returns 403 error and message</w:t>
+      </w:r>
+    </w:p>
+    <w:p>
+      <w:r>
+        <w:drawing>
+          <wp:inline distT="0" distB="0" distL="0" distR="0" wp14:anchorId="67523EC2" wp14:editId="593E7802">
+            <wp:extent cx="3816546" cy="381020"/>
+            <wp:effectExtent l="0" t="0" r="0" b="0"/>
+            <wp:docPr id="1299753906" name="Picture 1"/>
+            <wp:cNvGraphicFramePr>
+              <a:graphicFrameLocks xmlns:a="http://schemas.openxmlformats.org/drawingml/2006/main" noChangeAspect="1"/>
+            </wp:cNvGraphicFramePr>
+            <a:graphic xmlns:a="http://schemas.openxmlformats.org/drawingml/2006/main">
+              <a:graphicData uri="http://schemas.openxmlformats.org/drawingml/2006/picture">
+                <pic:pic xmlns:pic="http://schemas.openxmlformats.org/drawingml/2006/picture">
+                  <pic:nvPicPr>
+                    <pic:cNvPr id="1299753906" name=""/>
+                    <pic:cNvPicPr/>
+                  </pic:nvPicPr>
+                  <pic:blipFill>
+                    <a:blip r:embed="rId26"/>
+                    <a:stretch>
+                      <a:fillRect/>
+                    </a:stretch>
+                  </pic:blipFill>
+                  <pic:spPr>
+                    <a:xfrm>
+                      <a:off x="0" y="0"/>
+                      <a:ext cx="3816546" cy="381020"/>
+                    </a:xfrm>
+                    <a:prstGeom prst="rect">
+                      <a:avLst/>
+                    </a:prstGeom>
+                  </pic:spPr>
+                </pic:pic>
+              </a:graphicData>
+            </a:graphic>
+          </wp:inline>
+        </w:drawing>
+      </w:r>
+    </w:p>
+    <w:p>
+      <w:r>
+        <w:drawing>
+          <wp:inline distT="0" distB="0" distL="0" distR="0" wp14:anchorId="6D691070" wp14:editId="48782883">
+            <wp:extent cx="5943600" cy="3024505"/>
+            <wp:effectExtent l="0" t="0" r="0" b="4445"/>
+            <wp:docPr id="832148778" name="Picture 1"/>
+            <wp:cNvGraphicFramePr>
+              <a:graphicFrameLocks xmlns:a="http://schemas.openxmlformats.org/drawingml/2006/main" noChangeAspect="1"/>
+            </wp:cNvGraphicFramePr>
+            <a:graphic xmlns:a="http://schemas.openxmlformats.org/drawingml/2006/main">
+              <a:graphicData uri="http://schemas.openxmlformats.org/drawingml/2006/picture">
+                <pic:pic xmlns:pic="http://schemas.openxmlformats.org/drawingml/2006/picture">
+                  <pic:nvPicPr>
+                    <pic:cNvPr id="832148778" name=""/>
+                    <pic:cNvPicPr/>
+                  </pic:nvPicPr>
+                  <pic:blipFill>
+                    <a:blip r:embed="rId27"/>
+                    <a:stretch>
+                      <a:fillRect/>
+                    </a:stretch>
+                  </pic:blipFill>
+                  <pic:spPr>
+                    <a:xfrm>
+                      <a:off x="0" y="0"/>
+                      <a:ext cx="5943600" cy="3024505"/>
+                    </a:xfrm>
+                    <a:prstGeom prst="rect">
+                      <a:avLst/>
+                    </a:prstGeom>
+                  </pic:spPr>
+                </pic:pic>
+              </a:graphicData>
+            </a:graphic>
+          </wp:inline>
+        </w:drawing>
+      </w:r>
+    </w:p>
+    <w:p/>
+    <w:p>
+      <w:pPr>
+        <w:pStyle w:val="ListParagraph"/>
+        <w:numPr>
+          <w:ilvl w:val="0"/>
+          <w:numId w:val="2"/>
+        </w:numPr>
+      </w:pPr>
+      <w:r>
+        <w:t>Incorrect password returns 401 error and message, and increases failed_pw_count for user</w:t>
+      </w:r>
+    </w:p>
+    <w:p>
+      <w:r>
+        <w:drawing>
+          <wp:inline distT="0" distB="0" distL="0" distR="0" wp14:anchorId="5EC3675C" wp14:editId="05B584B4">
+            <wp:extent cx="5943600" cy="3104515"/>
+            <wp:effectExtent l="0" t="0" r="0" b="635"/>
+            <wp:docPr id="1621718721" name="Picture 1"/>
+            <wp:cNvGraphicFramePr>
+              <a:graphicFrameLocks xmlns:a="http://schemas.openxmlformats.org/drawingml/2006/main" noChangeAspect="1"/>
+            </wp:cNvGraphicFramePr>
+            <a:graphic xmlns:a="http://schemas.openxmlformats.org/drawingml/2006/main">
+              <a:graphicData uri="http://schemas.openxmlformats.org/drawingml/2006/picture">
+                <pic:pic xmlns:pic="http://schemas.openxmlformats.org/drawingml/2006/picture">
+                  <pic:nvPicPr>
+                    <pic:cNvPr id="1621718721" name=""/>
+                    <pic:cNvPicPr/>
+                  </pic:nvPicPr>
+                  <pic:blipFill>
+                    <a:blip r:embed="rId28"/>
+                    <a:stretch>
+                      <a:fillRect/>
+                    </a:stretch>
+                  </pic:blipFill>
+                  <pic:spPr>
+                    <a:xfrm>
+                      <a:off x="0" y="0"/>
+                      <a:ext cx="5943600" cy="3104515"/>
+                    </a:xfrm>
+                    <a:prstGeom prst="rect">
+                      <a:avLst/>
+                    </a:prstGeom>
+                  </pic:spPr>
+                </pic:pic>
+              </a:graphicData>
+            </a:graphic>
+          </wp:inline>
+        </w:drawing>
+      </w:r>
+    </w:p>
+    <w:p/>
+    <w:p/>
+    <w:p/>
+    <w:p>
+      <w:r>
+        <w:drawing>
+          <wp:inline distT="0" distB="0" distL="0" distR="0" wp14:anchorId="51E42CB9" wp14:editId="42966275">
+            <wp:extent cx="3720465" cy="527011"/>
+            <wp:effectExtent l="0" t="0" r="0" b="6985"/>
+            <wp:docPr id="1533601454" name="Picture 1"/>
+            <wp:cNvGraphicFramePr>
+              <a:graphicFrameLocks xmlns:a="http://schemas.openxmlformats.org/drawingml/2006/main" noChangeAspect="1"/>
+            </wp:cNvGraphicFramePr>
+            <a:graphic xmlns:a="http://schemas.openxmlformats.org/drawingml/2006/main">
+              <a:graphicData uri="http://schemas.openxmlformats.org/drawingml/2006/picture">
+                <pic:pic xmlns:pic="http://schemas.openxmlformats.org/drawingml/2006/picture">
+                  <pic:nvPicPr>
+                    <pic:cNvPr id="1533601454" name=""/>
+                    <pic:cNvPicPr/>
+                  </pic:nvPicPr>
+                  <pic:blipFill rotWithShape="1">
+                    <a:blip r:embed="rId29"/>
+                    <a:srcRect l="6985" t="-18582"/>
+                    <a:stretch>
+                      <a:fillRect/>
+                    </a:stretch>
+                  </pic:blipFill>
+                  <pic:spPr bwMode="auto">
+                    <a:xfrm>
+                      <a:off x="0" y="0"/>
+                      <a:ext cx="3721278" cy="527126"/>
+                    </a:xfrm>
+                    <a:prstGeom prst="rect">
+                      <a:avLst/>
+                    </a:prstGeom>
+                    <a:ln>
+                      <a:noFill/>
+                    </a:ln>
+                    <a:extLst>
+                      <a:ext uri="{53640926-AAD7-44D8-BBD7-CCE9431645EC}">
+                        <a14:shadowObscured xmlns:a14="http://schemas.microsoft.com/office/drawing/2010/main"/>
+                      </a:ext>
+                    </a:extLst>
+                  </pic:spPr>
+                </pic:pic>
+              </a:graphicData>
+            </a:graphic>
+          </wp:inline>
+        </w:drawing>
+      </w:r>
+      <w:r>
+        <w:drawing>
+          <wp:inline distT="0" distB="0" distL="0" distR="0" wp14:anchorId="1319A0C1" wp14:editId="5938BA1E">
+            <wp:extent cx="1320868" cy="711237"/>
+            <wp:effectExtent l="0" t="0" r="0" b="0"/>
+            <wp:docPr id="1635074250" name="Picture 1"/>
+            <wp:cNvGraphicFramePr>
+              <a:graphicFrameLocks xmlns:a="http://schemas.openxmlformats.org/drawingml/2006/main" noChangeAspect="1"/>
+            </wp:cNvGraphicFramePr>
+            <a:graphic xmlns:a="http://schemas.openxmlformats.org/drawingml/2006/main">
+              <a:graphicData uri="http://schemas.openxmlformats.org/drawingml/2006/picture">
+                <pic:pic xmlns:pic="http://schemas.openxmlformats.org/drawingml/2006/picture">
+                  <pic:nvPicPr>
+                    <pic:cNvPr id="1635074250" name=""/>
+                    <pic:cNvPicPr/>
+                  </pic:nvPicPr>
+                  <pic:blipFill>
+                    <a:blip r:embed="rId30"/>
+                    <a:stretch>
+                      <a:fillRect/>
+                    </a:stretch>
+                  </pic:blipFill>
+                  <pic:spPr>
+                    <a:xfrm>
+                      <a:off x="0" y="0"/>
+                      <a:ext cx="1320868" cy="711237"/>
+                    </a:xfrm>
+                    <a:prstGeom prst="rect">
+                      <a:avLst/>
+                    </a:prstGeom>
+                  </pic:spPr>
+                </pic:pic>
+              </a:graphicData>
+            </a:graphic>
+          </wp:inline>
+        </w:drawing>
+      </w:r>
+    </w:p>
+    <w:p>
+      <w:pPr>
+        <w:pStyle w:val="ListParagraph"/>
+        <w:numPr>
+          <w:ilvl w:val="0"/>
+          <w:numId w:val="2"/>
+        </w:numPr>
+      </w:pPr>
+      <w:r>
+        <w:t>Correct password resets failed_pw_count to zero</w:t>
+      </w:r>
+    </w:p>
+    <w:p>
+      <w:r>
+        <w:drawing>
+          <wp:inline distT="0" distB="0" distL="0" distR="0" wp14:anchorId="5B04E2F1" wp14:editId="65830D91">
+            <wp:extent cx="3720465" cy="527011"/>
+            <wp:effectExtent l="0" t="0" r="0" b="6985"/>
+            <wp:docPr id="528318488" name="Picture 1"/>
+            <wp:cNvGraphicFramePr>
+              <a:graphicFrameLocks xmlns:a="http://schemas.openxmlformats.org/drawingml/2006/main" noChangeAspect="1"/>
+            </wp:cNvGraphicFramePr>
+            <a:graphic xmlns:a="http://schemas.openxmlformats.org/drawingml/2006/main">
+              <a:graphicData uri="http://schemas.openxmlformats.org/drawingml/2006/picture">
+                <pic:pic xmlns:pic="http://schemas.openxmlformats.org/drawingml/2006/picture">
+                  <pic:nvPicPr>
+                    <pic:cNvPr id="1533601454" name=""/>
+                    <pic:cNvPicPr/>
+                  </pic:nvPicPr>
+                  <pic:blipFill rotWithShape="1">
+                    <a:blip r:embed="rId29"/>
+                    <a:srcRect l="6985" t="-18582"/>
+                    <a:stretch>
+                      <a:fillRect/>
+                    </a:stretch>
+                  </pic:blipFill>
+                  <pic:spPr bwMode="auto">
+                    <a:xfrm>
+                      <a:off x="0" y="0"/>
+                      <a:ext cx="3721278" cy="527126"/>
+                    </a:xfrm>
+                    <a:prstGeom prst="rect">
+                      <a:avLst/>
+                    </a:prstGeom>
+                    <a:ln>
+                      <a:noFill/>
+                    </a:ln>
+                    <a:extLst>
+                      <a:ext uri="{53640926-AAD7-44D8-BBD7-CCE9431645EC}">
+                        <a14:shadowObscured xmlns:a14="http://schemas.microsoft.com/office/drawing/2010/main"/>
+                      </a:ext>
+                    </a:extLst>
+                  </pic:spPr>
+                </pic:pic>
+              </a:graphicData>
+            </a:graphic>
+          </wp:inline>
+        </w:drawing>
+      </w:r>
+      <w:r>
+        <w:drawing>
+          <wp:inline distT="0" distB="0" distL="0" distR="0" wp14:anchorId="3A6E1571" wp14:editId="2C396805">
+            <wp:extent cx="1282766" cy="692186"/>
+            <wp:effectExtent l="0" t="0" r="0" b="0"/>
+            <wp:docPr id="1916372234" name="Picture 1"/>
+            <wp:cNvGraphicFramePr>
+              <a:graphicFrameLocks xmlns:a="http://schemas.openxmlformats.org/drawingml/2006/main" noChangeAspect="1"/>
+            </wp:cNvGraphicFramePr>
+            <a:graphic xmlns:a="http://schemas.openxmlformats.org/drawingml/2006/main">
+              <a:graphicData uri="http://schemas.openxmlformats.org/drawingml/2006/picture">
+                <pic:pic xmlns:pic="http://schemas.openxmlformats.org/drawingml/2006/picture">
+                  <pic:nvPicPr>
+                    <pic:cNvPr id="1916372234" name=""/>
+                    <pic:cNvPicPr/>
+                  </pic:nvPicPr>
+                  <pic:blipFill>
+                    <a:blip r:embed="rId31"/>
+                    <a:stretch>
+                      <a:fillRect/>
+                    </a:stretch>
+                  </pic:blipFill>
+                  <pic:spPr>
+                    <a:xfrm>
+                      <a:off x="0" y="0"/>
+                      <a:ext cx="1282766" cy="692186"/>
+                    </a:xfrm>
+                    <a:prstGeom prst="rect">
+                      <a:avLst/>
+                    </a:prstGeom>
+                  </pic:spPr>
+                </pic:pic>
+              </a:graphicData>
+            </a:graphic>
+          </wp:inline>
+        </w:drawing>
+      </w:r>
+    </w:p>
+    <w:p>
+      <w:pPr>
+        <w:pStyle w:val="ListParagraph"/>
+        <w:numPr>
+          <w:ilvl w:val="0"/>
+          <w:numId w:val="2"/>
+        </w:numPr>
+      </w:pPr>
+      <w:r>
+        <w:t>5 consecutive wrong password attempts returns 423 error and message</w:t>
+      </w:r>
+    </w:p>
+    <w:p>
+      <w:r>
+        <w:drawing>
+          <wp:inline distT="0" distB="0" distL="0" distR="0" wp14:anchorId="5D933DF8" wp14:editId="39E1E669">
+            <wp:extent cx="5943600" cy="3242945"/>
+            <wp:effectExtent l="0" t="0" r="0" b="0"/>
+            <wp:docPr id="377178524" name="Picture 1"/>
+            <wp:cNvGraphicFramePr>
+              <a:graphicFrameLocks xmlns:a="http://schemas.openxmlformats.org/drawingml/2006/main" noChangeAspect="1"/>
+            </wp:cNvGraphicFramePr>
+            <a:graphic xmlns:a="http://schemas.openxmlformats.org/drawingml/2006/main">
+              <a:graphicData uri="http://schemas.openxmlformats.org/drawingml/2006/picture">
+                <pic:pic xmlns:pic="http://schemas.openxmlformats.org/drawingml/2006/picture">
+                  <pic:nvPicPr>
+                    <pic:cNvPr id="377178524" name=""/>
+                    <pic:cNvPicPr/>
+                  </pic:nvPicPr>
+                  <pic:blipFill>
+                    <a:blip r:embed="rId32"/>
+                    <a:stretch>
+                      <a:fillRect/>
+                    </a:stretch>
+                  </pic:blipFill>
+                  <pic:spPr>
+                    <a:xfrm>
+                      <a:off x="0" y="0"/>
+                      <a:ext cx="5943600" cy="3242945"/>
+                    </a:xfrm>
+                    <a:prstGeom prst="rect">
+                      <a:avLst/>
+                    </a:prstGeom>
+                  </pic:spPr>
+                </pic:pic>
+              </a:graphicData>
+            </a:graphic>
+          </wp:inline>
+        </w:drawing>
+      </w:r>
+    </w:p>
     <w:sectPr>
       <w:pgSz w:w="12240" w:h="15840"/>
       <w:pgMar w:top="1440" w:right="1440" w:bottom="1440" w:left="1440" w:header="708" w:footer="708" w:gutter="0"/>
@@ -698,6 +1526,56 @@
     </w:sectPr>
   </w:body>
 </w:document>
+</file>
+
+<file path=word/endnotes.xml><?xml version="1.0" encoding="utf-8"?>
+<w:endnotes xmlns:wpc="http://schemas.microsoft.com/office/word/2010/wordprocessingCanvas" xmlns:cx="http://schemas.microsoft.com/office/drawing/2014/chartex" xmlns:cx1="http://schemas.microsoft.com/office/drawing/2015/9/8/chartex" xmlns:cx2="http://schemas.microsoft.com/office/drawing/2015/10/21/chartex" xmlns:cx3="http://schemas.microsoft.com/office/drawing/2016/5/9/chartex" xmlns:cx4="http://schemas.microsoft.com/office/drawing/2016/5/10/chartex" xmlns:cx5="http://schemas.microsoft.com/office/drawing/2016/5/11/chartex" xmlns:cx6="http://schemas.microsoft.com/office/drawing/2016/5/12/chartex" xmlns:cx7="http://schemas.microsoft.com/office/drawing/2016/5/13/chartex" xmlns:cx8="http://schemas.microsoft.com/office/drawing/2016/5/14/chartex" xmlns:mc="http://schemas.openxmlformats.org/markup-compatibility/2006" xmlns:aink="http://schemas.microsoft.com/office/drawing/2016/ink" xmlns:am3d="http://schemas.microsoft.com/office/drawing/2017/model3d" xmlns:o="urn:schemas-microsoft-com:office:office" xmlns:oel="http://schemas.microsoft.com/office/2019/extlst" xmlns:r="http://schemas.openxmlformats.org/officeDocument/2006/relationships" xmlns:m="http://schemas.openxmlformats.org/officeDocument/2006/math" xmlns:v="urn:schemas-microsoft-com:vml" xmlns:wp14="http://schemas.microsoft.com/office/word/2010/wordprocessingDrawing" xmlns:wp="http://schemas.openxmlformats.org/drawingml/2006/wordprocessingDrawing" xmlns:w10="urn:schemas-microsoft-com:office:word" xmlns:w="http://schemas.openxmlformats.org/wordprocessingml/2006/main" xmlns:w14="http://schemas.microsoft.com/office/word/2010/wordml" xmlns:w15="http://schemas.microsoft.com/office/word/2012/wordml" xmlns:w16cex="http://schemas.microsoft.com/office/word/2018/wordml/cex" xmlns:w16cid="http://schemas.microsoft.com/office/word/2016/wordml/cid" xmlns:w16="http://schemas.microsoft.com/office/word/2018/wordml" xmlns:w16du="http://schemas.microsoft.com/office/word/2023/wordml/word16du" xmlns:w16sdtdh="http://schemas.microsoft.com/office/word/2020/wordml/sdtdatahash" xmlns:w16sdtfl="http://schemas.microsoft.com/office/word/2024/wordml/sdtformatlock" xmlns:w16se="http://schemas.microsoft.com/office/word/2015/wordml/symex" xmlns:wpg="http://schemas.microsoft.com/office/word/2010/wordprocessingGroup" xmlns:wpi="http://schemas.microsoft.com/office/word/2010/wordprocessingInk" xmlns:wne="http://schemas.microsoft.com/office/word/2006/wordml" xmlns:wps="http://schemas.microsoft.com/office/word/2010/wordprocessingShape" mc:Ignorable="w14 w15 w16se w16cid w16 w16cex w16sdtdh w16sdtfl w16du wp14">
+  <w:endnote w:type="separator" w:id="-1">
+    <w:p>
+      <w:pPr>
+        <w:spacing w:after="0" w:line="240" w:lineRule="auto"/>
+      </w:pPr>
+      <w:r>
+        <w:separator/>
+      </w:r>
+    </w:p>
+  </w:endnote>
+  <w:endnote w:type="continuationSeparator" w:id="0">
+    <w:p>
+      <w:pPr>
+        <w:spacing w:after="0" w:line="240" w:lineRule="auto"/>
+      </w:pPr>
+      <w:r>
+        <w:continuationSeparator/>
+      </w:r>
+    </w:p>
+  </w:endnote>
+</w:endnotes>
+</file>
+
+<file path=word/footnotes.xml><?xml version="1.0" encoding="utf-8"?>
+<w:footnotes xmlns:wpc="http://schemas.microsoft.com/office/word/2010/wordprocessingCanvas" xmlns:cx="http://schemas.microsoft.com/office/drawing/2014/chartex" xmlns:cx1="http://schemas.microsoft.com/office/drawing/2015/9/8/chartex" xmlns:cx2="http://schemas.microsoft.com/office/drawing/2015/10/21/chartex" xmlns:cx3="http://schemas.microsoft.com/office/drawing/2016/5/9/chartex" xmlns:cx4="http://schemas.microsoft.com/office/drawing/2016/5/10/chartex" xmlns:cx5="http://schemas.microsoft.com/office/drawing/2016/5/11/chartex" xmlns:cx6="http://schemas.microsoft.com/office/drawing/2016/5/12/chartex" xmlns:cx7="http://schemas.microsoft.com/office/drawing/2016/5/13/chartex" xmlns:cx8="http://schemas.microsoft.com/office/drawing/2016/5/14/chartex" xmlns:mc="http://schemas.openxmlformats.org/markup-compatibility/2006" xmlns:aink="http://schemas.microsoft.com/office/drawing/2016/ink" xmlns:am3d="http://schemas.microsoft.com/office/drawing/2017/model3d" xmlns:o="urn:schemas-microsoft-com:office:office" xmlns:oel="http://schemas.microsoft.com/office/2019/extlst" xmlns:r="http://schemas.openxmlformats.org/officeDocument/2006/relationships" xmlns:m="http://schemas.openxmlformats.org/officeDocument/2006/math" xmlns:v="urn:schemas-microsoft-com:vml" xmlns:wp14="http://schemas.microsoft.com/office/word/2010/wordprocessingDrawing" xmlns:wp="http://schemas.openxmlformats.org/drawingml/2006/wordprocessingDrawing" xmlns:w10="urn:schemas-microsoft-com:office:word" xmlns:w="http://schemas.openxmlformats.org/wordprocessingml/2006/main" xmlns:w14="http://schemas.microsoft.com/office/word/2010/wordml" xmlns:w15="http://schemas.microsoft.com/office/word/2012/wordml" xmlns:w16cex="http://schemas.microsoft.com/office/word/2018/wordml/cex" xmlns:w16cid="http://schemas.microsoft.com/office/word/2016/wordml/cid" xmlns:w16="http://schemas.microsoft.com/office/word/2018/wordml" xmlns:w16du="http://schemas.microsoft.com/office/word/2023/wordml/word16du" xmlns:w16sdtdh="http://schemas.microsoft.com/office/word/2020/wordml/sdtdatahash" xmlns:w16sdtfl="http://schemas.microsoft.com/office/word/2024/wordml/sdtformatlock" xmlns:w16se="http://schemas.microsoft.com/office/word/2015/wordml/symex" xmlns:wpg="http://schemas.microsoft.com/office/word/2010/wordprocessingGroup" xmlns:wpi="http://schemas.microsoft.com/office/word/2010/wordprocessingInk" xmlns:wne="http://schemas.microsoft.com/office/word/2006/wordml" xmlns:wps="http://schemas.microsoft.com/office/word/2010/wordprocessingShape" mc:Ignorable="w14 w15 w16se w16cid w16 w16cex w16sdtdh w16sdtfl w16du wp14">
+  <w:footnote w:type="separator" w:id="-1">
+    <w:p>
+      <w:pPr>
+        <w:spacing w:after="0" w:line="240" w:lineRule="auto"/>
+      </w:pPr>
+      <w:r>
+        <w:separator/>
+      </w:r>
+    </w:p>
+  </w:footnote>
+  <w:footnote w:type="continuationSeparator" w:id="0">
+    <w:p>
+      <w:pPr>
+        <w:spacing w:after="0" w:line="240" w:lineRule="auto"/>
+      </w:pPr>
+      <w:r>
+        <w:continuationSeparator/>
+      </w:r>
+    </w:p>
+  </w:footnote>
+</w:footnotes>
 </file>
 
 <file path=word/numbering.xml><?xml version="1.0" encoding="utf-8"?>
@@ -723,8 +1601,100 @@
       </w:rPr>
     </w:lvl>
   </w:abstractNum>
+  <w:abstractNum w:abstractNumId="1" w15:restartNumberingAfterBreak="0">
+    <w:nsid w:val="1DF15188"/>
+    <w:multiLevelType w:val="hybridMultilevel"/>
+    <w:tmpl w:val="84A4ED16"/>
+    <w:lvl w:ilvl="0" w:tplc="1009000F">
+      <w:start w:val="1"/>
+      <w:numFmt w:val="decimal"/>
+      <w:lvlText w:val="%1."/>
+      <w:lvlJc w:val="left"/>
+      <w:pPr>
+        <w:ind w:left="720" w:hanging="360"/>
+      </w:pPr>
+      <w:rPr>
+        <w:rFonts w:hint="default"/>
+      </w:rPr>
+    </w:lvl>
+    <w:lvl w:ilvl="1" w:tplc="10090019" w:tentative="1">
+      <w:start w:val="1"/>
+      <w:numFmt w:val="lowerLetter"/>
+      <w:lvlText w:val="%2."/>
+      <w:lvlJc w:val="left"/>
+      <w:pPr>
+        <w:ind w:left="1440" w:hanging="360"/>
+      </w:pPr>
+    </w:lvl>
+    <w:lvl w:ilvl="2" w:tplc="1009001B" w:tentative="1">
+      <w:start w:val="1"/>
+      <w:numFmt w:val="lowerRoman"/>
+      <w:lvlText w:val="%3."/>
+      <w:lvlJc w:val="right"/>
+      <w:pPr>
+        <w:ind w:left="2160" w:hanging="180"/>
+      </w:pPr>
+    </w:lvl>
+    <w:lvl w:ilvl="3" w:tplc="1009000F" w:tentative="1">
+      <w:start w:val="1"/>
+      <w:numFmt w:val="decimal"/>
+      <w:lvlText w:val="%4."/>
+      <w:lvlJc w:val="left"/>
+      <w:pPr>
+        <w:ind w:left="2880" w:hanging="360"/>
+      </w:pPr>
+    </w:lvl>
+    <w:lvl w:ilvl="4" w:tplc="10090019" w:tentative="1">
+      <w:start w:val="1"/>
+      <w:numFmt w:val="lowerLetter"/>
+      <w:lvlText w:val="%5."/>
+      <w:lvlJc w:val="left"/>
+      <w:pPr>
+        <w:ind w:left="3600" w:hanging="360"/>
+      </w:pPr>
+    </w:lvl>
+    <w:lvl w:ilvl="5" w:tplc="1009001B" w:tentative="1">
+      <w:start w:val="1"/>
+      <w:numFmt w:val="lowerRoman"/>
+      <w:lvlText w:val="%6."/>
+      <w:lvlJc w:val="right"/>
+      <w:pPr>
+        <w:ind w:left="4320" w:hanging="180"/>
+      </w:pPr>
+    </w:lvl>
+    <w:lvl w:ilvl="6" w:tplc="1009000F" w:tentative="1">
+      <w:start w:val="1"/>
+      <w:numFmt w:val="decimal"/>
+      <w:lvlText w:val="%7."/>
+      <w:lvlJc w:val="left"/>
+      <w:pPr>
+        <w:ind w:left="5040" w:hanging="360"/>
+      </w:pPr>
+    </w:lvl>
+    <w:lvl w:ilvl="7" w:tplc="10090019" w:tentative="1">
+      <w:start w:val="1"/>
+      <w:numFmt w:val="lowerLetter"/>
+      <w:lvlText w:val="%8."/>
+      <w:lvlJc w:val="left"/>
+      <w:pPr>
+        <w:ind w:left="5760" w:hanging="360"/>
+      </w:pPr>
+    </w:lvl>
+    <w:lvl w:ilvl="8" w:tplc="1009001B" w:tentative="1">
+      <w:start w:val="1"/>
+      <w:numFmt w:val="lowerRoman"/>
+      <w:lvlText w:val="%9."/>
+      <w:lvlJc w:val="right"/>
+      <w:pPr>
+        <w:ind w:left="6480" w:hanging="180"/>
+      </w:pPr>
+    </w:lvl>
+  </w:abstractNum>
   <w:num w:numId="1" w16cid:durableId="767429201">
     <w:abstractNumId w:val="0"/>
+  </w:num>
+  <w:num w:numId="2" w16cid:durableId="796988475">
+    <w:abstractNumId w:val="1"/>
   </w:num>
 </w:numbering>
 </file>
@@ -1332,7 +2302,6 @@
   <w:style w:type="character" w:default="1" w:styleId="DefaultParagraphFont">
     <w:name w:val="Default Paragraph Font"/>
     <w:uiPriority w:val="1"/>
-    <w:semiHidden/>
     <w:unhideWhenUsed/>
   </w:style>
   <w:style w:type="table" w:default="1" w:styleId="TableNormal">
@@ -1658,6 +2627,50 @@
       </w:numPr>
       <w:contextualSpacing/>
     </w:pPr>
+  </w:style>
+  <w:style w:type="paragraph" w:styleId="Header">
+    <w:name w:val="header"/>
+    <w:basedOn w:val="Normal"/>
+    <w:link w:val="HeaderChar"/>
+    <w:uiPriority w:val="99"/>
+    <w:unhideWhenUsed/>
+    <w:rsid w:val="0017339F"/>
+    <w:pPr>
+      <w:tabs>
+        <w:tab w:val="center" w:pos="4680"/>
+        <w:tab w:val="right" w:pos="9360"/>
+      </w:tabs>
+      <w:spacing w:after="0" w:line="240" w:lineRule="auto"/>
+    </w:pPr>
+  </w:style>
+  <w:style w:type="character" w:customStyle="1" w:styleId="HeaderChar">
+    <w:name w:val="Header Char"/>
+    <w:basedOn w:val="DefaultParagraphFont"/>
+    <w:link w:val="Header"/>
+    <w:uiPriority w:val="99"/>
+    <w:rsid w:val="0017339F"/>
+  </w:style>
+  <w:style w:type="paragraph" w:styleId="Footer">
+    <w:name w:val="footer"/>
+    <w:basedOn w:val="Normal"/>
+    <w:link w:val="FooterChar"/>
+    <w:uiPriority w:val="99"/>
+    <w:unhideWhenUsed/>
+    <w:rsid w:val="0017339F"/>
+    <w:pPr>
+      <w:tabs>
+        <w:tab w:val="center" w:pos="4680"/>
+        <w:tab w:val="right" w:pos="9360"/>
+      </w:tabs>
+      <w:spacing w:after="0" w:line="240" w:lineRule="auto"/>
+    </w:pPr>
+  </w:style>
+  <w:style w:type="character" w:customStyle="1" w:styleId="FooterChar">
+    <w:name w:val="Footer Char"/>
+    <w:basedOn w:val="DefaultParagraphFont"/>
+    <w:link w:val="Footer"/>
+    <w:uiPriority w:val="99"/>
+    <w:rsid w:val="0017339F"/>
   </w:style>
 </w:styles>
 </file>

</xml_diff>

<commit_message>
Added manual test results for register page functionality
</commit_message>
<xml_diff>
--- a/test results/capstone_test_results.docx
+++ b/test results/capstone_test_results.docx
@@ -1506,6 +1506,278 @@
                     <a:xfrm>
                       <a:off x="0" y="0"/>
                       <a:ext cx="5943600" cy="3242945"/>
+                    </a:xfrm>
+                    <a:prstGeom prst="rect">
+                      <a:avLst/>
+                    </a:prstGeom>
+                  </pic:spPr>
+                </pic:pic>
+              </a:graphicData>
+            </a:graphic>
+          </wp:inline>
+        </w:drawing>
+      </w:r>
+    </w:p>
+    <w:p/>
+    <w:p/>
+    <w:p/>
+    <w:p/>
+    <w:p/>
+    <w:p/>
+    <w:p/>
+    <w:p/>
+    <w:p>
+      <w:pPr>
+        <w:rPr>
+          <w:bCs/>
+          <w:sz w:val="28"/>
+          <w:szCs w:val="28"/>
+        </w:rPr>
+      </w:pPr>
+      <w:r>
+        <w:rPr>
+          <w:b/>
+          <w:sz w:val="28"/>
+          <w:szCs w:val="28"/>
+        </w:rPr>
+        <w:lastRenderedPageBreak/>
+        <w:t>Front End Manual</w:t>
+      </w:r>
+    </w:p>
+    <w:p>
+      <w:pPr>
+        <w:pStyle w:val="ListParagraph"/>
+        <w:numPr>
+          <w:ilvl w:val="0"/>
+          <w:numId w:val="2"/>
+        </w:numPr>
+        <w:rPr>
+          <w:bCs/>
+        </w:rPr>
+      </w:pPr>
+      <w:r>
+        <w:rPr>
+          <w:bCs/>
+        </w:rPr>
+        <w:t>Submitting a registered email displays registered error message</w:t>
+      </w:r>
+    </w:p>
+    <w:p>
+      <w:pPr>
+        <w:rPr>
+          <w:bCs/>
+        </w:rPr>
+      </w:pPr>
+      <w:r>
+        <w:rPr>
+          <w:bCs/>
+        </w:rPr>
+        <w:drawing>
+          <wp:inline distT="0" distB="0" distL="0" distR="0" wp14:anchorId="5EF726E4" wp14:editId="40CDC18B">
+            <wp:extent cx="5943600" cy="2083435"/>
+            <wp:effectExtent l="0" t="0" r="0" b="0"/>
+            <wp:docPr id="70928444" name="Picture 1"/>
+            <wp:cNvGraphicFramePr>
+              <a:graphicFrameLocks xmlns:a="http://schemas.openxmlformats.org/drawingml/2006/main" noChangeAspect="1"/>
+            </wp:cNvGraphicFramePr>
+            <a:graphic xmlns:a="http://schemas.openxmlformats.org/drawingml/2006/main">
+              <a:graphicData uri="http://schemas.openxmlformats.org/drawingml/2006/picture">
+                <pic:pic xmlns:pic="http://schemas.openxmlformats.org/drawingml/2006/picture">
+                  <pic:nvPicPr>
+                    <pic:cNvPr id="70928444" name=""/>
+                    <pic:cNvPicPr/>
+                  </pic:nvPicPr>
+                  <pic:blipFill>
+                    <a:blip r:embed="rId33"/>
+                    <a:stretch>
+                      <a:fillRect/>
+                    </a:stretch>
+                  </pic:blipFill>
+                  <pic:spPr>
+                    <a:xfrm>
+                      <a:off x="0" y="0"/>
+                      <a:ext cx="5943600" cy="2083435"/>
+                    </a:xfrm>
+                    <a:prstGeom prst="rect">
+                      <a:avLst/>
+                    </a:prstGeom>
+                  </pic:spPr>
+                </pic:pic>
+              </a:graphicData>
+            </a:graphic>
+          </wp:inline>
+        </w:drawing>
+      </w:r>
+    </w:p>
+    <w:p>
+      <w:pPr>
+        <w:pStyle w:val="ListParagraph"/>
+        <w:numPr>
+          <w:ilvl w:val="0"/>
+          <w:numId w:val="2"/>
+        </w:numPr>
+        <w:rPr>
+          <w:bCs/>
+        </w:rPr>
+      </w:pPr>
+      <w:r>
+        <w:rPr>
+          <w:bCs/>
+        </w:rPr>
+        <w:t>Submitting incorrect input displays respective error messages</w:t>
+      </w:r>
+    </w:p>
+    <w:p>
+      <w:pPr>
+        <w:ind w:left="360"/>
+        <w:rPr>
+          <w:bCs/>
+        </w:rPr>
+      </w:pPr>
+      <w:r>
+        <w:rPr>
+          <w:bCs/>
+        </w:rPr>
+        <w:drawing>
+          <wp:inline distT="0" distB="0" distL="0" distR="0" wp14:anchorId="54346D2C" wp14:editId="007B9242">
+            <wp:extent cx="5570806" cy="2052152"/>
+            <wp:effectExtent l="0" t="0" r="0" b="5715"/>
+            <wp:docPr id="580321293" name="Picture 1"/>
+            <wp:cNvGraphicFramePr>
+              <a:graphicFrameLocks xmlns:a="http://schemas.openxmlformats.org/drawingml/2006/main" noChangeAspect="1"/>
+            </wp:cNvGraphicFramePr>
+            <a:graphic xmlns:a="http://schemas.openxmlformats.org/drawingml/2006/main">
+              <a:graphicData uri="http://schemas.openxmlformats.org/drawingml/2006/picture">
+                <pic:pic xmlns:pic="http://schemas.openxmlformats.org/drawingml/2006/picture">
+                  <pic:nvPicPr>
+                    <pic:cNvPr id="580321293" name=""/>
+                    <pic:cNvPicPr/>
+                  </pic:nvPicPr>
+                  <pic:blipFill>
+                    <a:blip r:embed="rId34"/>
+                    <a:stretch>
+                      <a:fillRect/>
+                    </a:stretch>
+                  </pic:blipFill>
+                  <pic:spPr>
+                    <a:xfrm>
+                      <a:off x="0" y="0"/>
+                      <a:ext cx="5576072" cy="2054092"/>
+                    </a:xfrm>
+                    <a:prstGeom prst="rect">
+                      <a:avLst/>
+                    </a:prstGeom>
+                  </pic:spPr>
+                </pic:pic>
+              </a:graphicData>
+            </a:graphic>
+          </wp:inline>
+        </w:drawing>
+      </w:r>
+    </w:p>
+    <w:p>
+      <w:pPr>
+        <w:pStyle w:val="ListParagraph"/>
+        <w:numPr>
+          <w:ilvl w:val="0"/>
+          <w:numId w:val="2"/>
+        </w:numPr>
+        <w:rPr>
+          <w:bCs/>
+        </w:rPr>
+      </w:pPr>
+      <w:r>
+        <w:rPr>
+          <w:bCs/>
+        </w:rPr>
+        <w:t>Successful registration redirects to /login</w:t>
+      </w:r>
+    </w:p>
+    <w:p>
+      <w:pPr>
+        <w:ind w:left="360"/>
+        <w:rPr>
+          <w:bCs/>
+        </w:rPr>
+      </w:pPr>
+      <w:r>
+        <w:rPr>
+          <w:bCs/>
+        </w:rPr>
+        <w:drawing>
+          <wp:inline distT="0" distB="0" distL="0" distR="0" wp14:anchorId="3BFB3B28" wp14:editId="59B99C37">
+            <wp:extent cx="5943600" cy="1883410"/>
+            <wp:effectExtent l="0" t="0" r="0" b="2540"/>
+            <wp:docPr id="1265853922" name="Picture 1"/>
+            <wp:cNvGraphicFramePr>
+              <a:graphicFrameLocks xmlns:a="http://schemas.openxmlformats.org/drawingml/2006/main" noChangeAspect="1"/>
+            </wp:cNvGraphicFramePr>
+            <a:graphic xmlns:a="http://schemas.openxmlformats.org/drawingml/2006/main">
+              <a:graphicData uri="http://schemas.openxmlformats.org/drawingml/2006/picture">
+                <pic:pic xmlns:pic="http://schemas.openxmlformats.org/drawingml/2006/picture">
+                  <pic:nvPicPr>
+                    <pic:cNvPr id="1265853922" name=""/>
+                    <pic:cNvPicPr/>
+                  </pic:nvPicPr>
+                  <pic:blipFill>
+                    <a:blip r:embed="rId35"/>
+                    <a:stretch>
+                      <a:fillRect/>
+                    </a:stretch>
+                  </pic:blipFill>
+                  <pic:spPr>
+                    <a:xfrm>
+                      <a:off x="0" y="0"/>
+                      <a:ext cx="5943600" cy="1883410"/>
+                    </a:xfrm>
+                    <a:prstGeom prst="rect">
+                      <a:avLst/>
+                    </a:prstGeom>
+                  </pic:spPr>
+                </pic:pic>
+              </a:graphicData>
+            </a:graphic>
+          </wp:inline>
+        </w:drawing>
+      </w:r>
+    </w:p>
+    <w:p>
+      <w:pPr>
+        <w:ind w:left="360"/>
+        <w:rPr>
+          <w:bCs/>
+        </w:rPr>
+      </w:pPr>
+      <w:r>
+        <w:rPr>
+          <w:bCs/>
+        </w:rPr>
+        <w:lastRenderedPageBreak/>
+        <w:drawing>
+          <wp:inline distT="0" distB="0" distL="0" distR="0" wp14:anchorId="451D62DD" wp14:editId="5271BAE5">
+            <wp:extent cx="5943600" cy="1192530"/>
+            <wp:effectExtent l="0" t="0" r="0" b="7620"/>
+            <wp:docPr id="1431546114" name="Picture 1"/>
+            <wp:cNvGraphicFramePr>
+              <a:graphicFrameLocks xmlns:a="http://schemas.openxmlformats.org/drawingml/2006/main" noChangeAspect="1"/>
+            </wp:cNvGraphicFramePr>
+            <a:graphic xmlns:a="http://schemas.openxmlformats.org/drawingml/2006/main">
+              <a:graphicData uri="http://schemas.openxmlformats.org/drawingml/2006/picture">
+                <pic:pic xmlns:pic="http://schemas.openxmlformats.org/drawingml/2006/picture">
+                  <pic:nvPicPr>
+                    <pic:cNvPr id="1431546114" name=""/>
+                    <pic:cNvPicPr/>
+                  </pic:nvPicPr>
+                  <pic:blipFill>
+                    <a:blip r:embed="rId36"/>
+                    <a:stretch>
+                      <a:fillRect/>
+                    </a:stretch>
+                  </pic:blipFill>
+                  <pic:spPr>
+                    <a:xfrm>
+                      <a:off x="0" y="0"/>
+                      <a:ext cx="5943600" cy="1192530"/>
                     </a:xfrm>
                     <a:prstGeom prst="rect">
                       <a:avLst/>

</xml_diff>

<commit_message>
Tested and documented /login and /dashboard functionality
</commit_message>
<xml_diff>
--- a/test results/capstone_test_results.docx
+++ b/test results/capstone_test_results.docx
@@ -1529,19 +1529,36 @@
     <w:p>
       <w:pPr>
         <w:rPr>
-          <w:bCs/>
-          <w:sz w:val="28"/>
-          <w:szCs w:val="28"/>
-        </w:rPr>
-      </w:pPr>
-      <w:r>
-        <w:rPr>
           <w:b/>
           <w:sz w:val="28"/>
           <w:szCs w:val="28"/>
         </w:rPr>
+      </w:pPr>
+      <w:r>
+        <w:rPr>
+          <w:b/>
+          <w:sz w:val="28"/>
+          <w:szCs w:val="28"/>
+        </w:rPr>
         <w:lastRenderedPageBreak/>
         <w:t>Front End Manual</w:t>
+      </w:r>
+    </w:p>
+    <w:p>
+      <w:pPr>
+        <w:rPr>
+          <w:bCs/>
+          <w:sz w:val="24"/>
+          <w:szCs w:val="24"/>
+        </w:rPr>
+      </w:pPr>
+      <w:r>
+        <w:rPr>
+          <w:b/>
+          <w:sz w:val="24"/>
+          <w:szCs w:val="24"/>
+        </w:rPr>
+        <w:t>/register</w:t>
       </w:r>
     </w:p>
     <w:p>
@@ -1789,6 +1806,548 @@
           </wp:inline>
         </w:drawing>
       </w:r>
+    </w:p>
+    <w:p>
+      <w:pPr>
+        <w:ind w:left="360"/>
+        <w:rPr>
+          <w:bCs/>
+        </w:rPr>
+      </w:pPr>
+    </w:p>
+    <w:p>
+      <w:pPr>
+        <w:ind w:left="360"/>
+        <w:rPr>
+          <w:bCs/>
+          <w:sz w:val="24"/>
+          <w:szCs w:val="24"/>
+        </w:rPr>
+      </w:pPr>
+      <w:r>
+        <w:rPr>
+          <w:b/>
+          <w:sz w:val="24"/>
+          <w:szCs w:val="24"/>
+        </w:rPr>
+        <w:t>/login</w:t>
+      </w:r>
+    </w:p>
+    <w:p>
+      <w:pPr>
+        <w:pStyle w:val="ListParagraph"/>
+        <w:numPr>
+          <w:ilvl w:val="0"/>
+          <w:numId w:val="2"/>
+        </w:numPr>
+        <w:rPr>
+          <w:bCs/>
+        </w:rPr>
+      </w:pPr>
+      <w:r>
+        <w:rPr>
+          <w:bCs/>
+        </w:rPr>
+        <w:t>Successful login redirects to /dashboard and saves user details in local storage</w:t>
+      </w:r>
+    </w:p>
+    <w:p>
+      <w:pPr>
+        <w:ind w:left="360"/>
+        <w:rPr>
+          <w:bCs/>
+        </w:rPr>
+      </w:pPr>
+      <w:r>
+        <w:rPr>
+          <w:bCs/>
+        </w:rPr>
+        <w:drawing>
+          <wp:inline distT="0" distB="0" distL="0" distR="0" wp14:anchorId="33E36088" wp14:editId="2E421582">
+            <wp:extent cx="5943600" cy="2207260"/>
+            <wp:effectExtent l="0" t="0" r="0" b="2540"/>
+            <wp:docPr id="983990014" name="Picture 1"/>
+            <wp:cNvGraphicFramePr>
+              <a:graphicFrameLocks xmlns:a="http://schemas.openxmlformats.org/drawingml/2006/main" noChangeAspect="1"/>
+            </wp:cNvGraphicFramePr>
+            <a:graphic xmlns:a="http://schemas.openxmlformats.org/drawingml/2006/main">
+              <a:graphicData uri="http://schemas.openxmlformats.org/drawingml/2006/picture">
+                <pic:pic xmlns:pic="http://schemas.openxmlformats.org/drawingml/2006/picture">
+                  <pic:nvPicPr>
+                    <pic:cNvPr id="983990014" name=""/>
+                    <pic:cNvPicPr/>
+                  </pic:nvPicPr>
+                  <pic:blipFill>
+                    <a:blip r:embed="rId37"/>
+                    <a:stretch>
+                      <a:fillRect/>
+                    </a:stretch>
+                  </pic:blipFill>
+                  <pic:spPr>
+                    <a:xfrm>
+                      <a:off x="0" y="0"/>
+                      <a:ext cx="5943600" cy="2207260"/>
+                    </a:xfrm>
+                    <a:prstGeom prst="rect">
+                      <a:avLst/>
+                    </a:prstGeom>
+                  </pic:spPr>
+                </pic:pic>
+              </a:graphicData>
+            </a:graphic>
+          </wp:inline>
+        </w:drawing>
+      </w:r>
+    </w:p>
+    <w:p>
+      <w:pPr>
+        <w:ind w:left="360"/>
+        <w:rPr>
+          <w:bCs/>
+        </w:rPr>
+      </w:pPr>
+      <w:r>
+        <w:rPr>
+          <w:bCs/>
+        </w:rPr>
+        <w:t>TODO:</w:t>
+      </w:r>
+    </w:p>
+    <w:p>
+      <w:pPr>
+        <w:pStyle w:val="ListParagraph"/>
+        <w:numPr>
+          <w:ilvl w:val="0"/>
+          <w:numId w:val="2"/>
+        </w:numPr>
+        <w:rPr>
+          <w:bCs/>
+        </w:rPr>
+      </w:pPr>
+      <w:r>
+        <w:rPr>
+          <w:bCs/>
+        </w:rPr>
+        <w:t>Missing input displays error message</w:t>
+      </w:r>
+    </w:p>
+    <w:p>
+      <w:pPr>
+        <w:ind w:left="360"/>
+        <w:rPr>
+          <w:bCs/>
+        </w:rPr>
+      </w:pPr>
+      <w:r>
+        <w:rPr>
+          <w:bCs/>
+        </w:rPr>
+        <w:drawing>
+          <wp:inline distT="0" distB="0" distL="0" distR="0" wp14:anchorId="497FEC99" wp14:editId="2B2A6286">
+            <wp:extent cx="5831592" cy="1772529"/>
+            <wp:effectExtent l="0" t="0" r="0" b="0"/>
+            <wp:docPr id="1250461574" name="Picture 1"/>
+            <wp:cNvGraphicFramePr>
+              <a:graphicFrameLocks xmlns:a="http://schemas.openxmlformats.org/drawingml/2006/main" noChangeAspect="1"/>
+            </wp:cNvGraphicFramePr>
+            <a:graphic xmlns:a="http://schemas.openxmlformats.org/drawingml/2006/main">
+              <a:graphicData uri="http://schemas.openxmlformats.org/drawingml/2006/picture">
+                <pic:pic xmlns:pic="http://schemas.openxmlformats.org/drawingml/2006/picture">
+                  <pic:nvPicPr>
+                    <pic:cNvPr id="1250461574" name=""/>
+                    <pic:cNvPicPr/>
+                  </pic:nvPicPr>
+                  <pic:blipFill>
+                    <a:blip r:embed="rId38"/>
+                    <a:stretch>
+                      <a:fillRect/>
+                    </a:stretch>
+                  </pic:blipFill>
+                  <pic:spPr>
+                    <a:xfrm>
+                      <a:off x="0" y="0"/>
+                      <a:ext cx="5837986" cy="1774473"/>
+                    </a:xfrm>
+                    <a:prstGeom prst="rect">
+                      <a:avLst/>
+                    </a:prstGeom>
+                  </pic:spPr>
+                </pic:pic>
+              </a:graphicData>
+            </a:graphic>
+          </wp:inline>
+        </w:drawing>
+      </w:r>
+    </w:p>
+    <w:p>
+      <w:pPr>
+        <w:ind w:left="360"/>
+        <w:rPr>
+          <w:bCs/>
+        </w:rPr>
+      </w:pPr>
+    </w:p>
+    <w:p>
+      <w:pPr>
+        <w:ind w:left="360"/>
+        <w:rPr>
+          <w:bCs/>
+        </w:rPr>
+      </w:pPr>
+    </w:p>
+    <w:p>
+      <w:pPr>
+        <w:ind w:left="360"/>
+        <w:rPr>
+          <w:bCs/>
+        </w:rPr>
+      </w:pPr>
+    </w:p>
+    <w:p>
+      <w:pPr>
+        <w:ind w:left="360"/>
+        <w:rPr>
+          <w:bCs/>
+        </w:rPr>
+      </w:pPr>
+    </w:p>
+    <w:p>
+      <w:pPr>
+        <w:pStyle w:val="ListParagraph"/>
+        <w:numPr>
+          <w:ilvl w:val="0"/>
+          <w:numId w:val="2"/>
+        </w:numPr>
+        <w:rPr>
+          <w:bCs/>
+        </w:rPr>
+      </w:pPr>
+      <w:r>
+        <w:rPr>
+          <w:bCs/>
+        </w:rPr>
+        <w:lastRenderedPageBreak/>
+        <w:t>Incorrect email or password displays error message</w:t>
+      </w:r>
+    </w:p>
+    <w:p>
+      <w:pPr>
+        <w:ind w:left="360"/>
+        <w:rPr>
+          <w:bCs/>
+        </w:rPr>
+      </w:pPr>
+      <w:r>
+        <w:rPr>
+          <w:bCs/>
+        </w:rPr>
+        <w:drawing>
+          <wp:inline distT="0" distB="0" distL="0" distR="0" wp14:anchorId="0B3811DA" wp14:editId="509E7D84">
+            <wp:extent cx="5943600" cy="1767840"/>
+            <wp:effectExtent l="0" t="0" r="0" b="3810"/>
+            <wp:docPr id="1530317421" name="Picture 1"/>
+            <wp:cNvGraphicFramePr>
+              <a:graphicFrameLocks xmlns:a="http://schemas.openxmlformats.org/drawingml/2006/main" noChangeAspect="1"/>
+            </wp:cNvGraphicFramePr>
+            <a:graphic xmlns:a="http://schemas.openxmlformats.org/drawingml/2006/main">
+              <a:graphicData uri="http://schemas.openxmlformats.org/drawingml/2006/picture">
+                <pic:pic xmlns:pic="http://schemas.openxmlformats.org/drawingml/2006/picture">
+                  <pic:nvPicPr>
+                    <pic:cNvPr id="1530317421" name=""/>
+                    <pic:cNvPicPr/>
+                  </pic:nvPicPr>
+                  <pic:blipFill>
+                    <a:blip r:embed="rId39"/>
+                    <a:stretch>
+                      <a:fillRect/>
+                    </a:stretch>
+                  </pic:blipFill>
+                  <pic:spPr>
+                    <a:xfrm>
+                      <a:off x="0" y="0"/>
+                      <a:ext cx="5943600" cy="1767840"/>
+                    </a:xfrm>
+                    <a:prstGeom prst="rect">
+                      <a:avLst/>
+                    </a:prstGeom>
+                  </pic:spPr>
+                </pic:pic>
+              </a:graphicData>
+            </a:graphic>
+          </wp:inline>
+        </w:drawing>
+      </w:r>
+    </w:p>
+    <w:p>
+      <w:pPr>
+        <w:pStyle w:val="ListParagraph"/>
+        <w:numPr>
+          <w:ilvl w:val="0"/>
+          <w:numId w:val="2"/>
+        </w:numPr>
+        <w:rPr>
+          <w:bCs/>
+        </w:rPr>
+      </w:pPr>
+      <w:r>
+        <w:rPr>
+          <w:bCs/>
+        </w:rPr>
+        <w:t>5 incorrect password attempts displays locked error message</w:t>
+      </w:r>
+    </w:p>
+    <w:p>
+      <w:pPr>
+        <w:ind w:left="360"/>
+        <w:rPr>
+          <w:bCs/>
+        </w:rPr>
+      </w:pPr>
+      <w:r>
+        <w:rPr>
+          <w:bCs/>
+        </w:rPr>
+        <w:drawing>
+          <wp:inline distT="0" distB="0" distL="0" distR="0" wp14:anchorId="019EAE9B" wp14:editId="712DB708">
+            <wp:extent cx="5943600" cy="1739900"/>
+            <wp:effectExtent l="0" t="0" r="0" b="0"/>
+            <wp:docPr id="546779359" name="Picture 1"/>
+            <wp:cNvGraphicFramePr>
+              <a:graphicFrameLocks xmlns:a="http://schemas.openxmlformats.org/drawingml/2006/main" noChangeAspect="1"/>
+            </wp:cNvGraphicFramePr>
+            <a:graphic xmlns:a="http://schemas.openxmlformats.org/drawingml/2006/main">
+              <a:graphicData uri="http://schemas.openxmlformats.org/drawingml/2006/picture">
+                <pic:pic xmlns:pic="http://schemas.openxmlformats.org/drawingml/2006/picture">
+                  <pic:nvPicPr>
+                    <pic:cNvPr id="546779359" name=""/>
+                    <pic:cNvPicPr/>
+                  </pic:nvPicPr>
+                  <pic:blipFill>
+                    <a:blip r:embed="rId40"/>
+                    <a:stretch>
+                      <a:fillRect/>
+                    </a:stretch>
+                  </pic:blipFill>
+                  <pic:spPr>
+                    <a:xfrm>
+                      <a:off x="0" y="0"/>
+                      <a:ext cx="5943600" cy="1739900"/>
+                    </a:xfrm>
+                    <a:prstGeom prst="rect">
+                      <a:avLst/>
+                    </a:prstGeom>
+                  </pic:spPr>
+                </pic:pic>
+              </a:graphicData>
+            </a:graphic>
+          </wp:inline>
+        </w:drawing>
+      </w:r>
+    </w:p>
+    <w:p>
+      <w:pPr>
+        <w:rPr>
+          <w:bCs/>
+        </w:rPr>
+      </w:pPr>
+    </w:p>
+    <w:p>
+      <w:pPr>
+        <w:rPr>
+          <w:b/>
+        </w:rPr>
+      </w:pPr>
+      <w:r>
+        <w:rPr>
+          <w:b/>
+        </w:rPr>
+        <w:t>/dashboard</w:t>
+      </w:r>
+    </w:p>
+    <w:p>
+      <w:pPr>
+        <w:pStyle w:val="ListParagraph"/>
+        <w:numPr>
+          <w:ilvl w:val="0"/>
+          <w:numId w:val="2"/>
+        </w:numPr>
+        <w:rPr>
+          <w:bCs/>
+        </w:rPr>
+      </w:pPr>
+      <w:r>
+        <w:rPr>
+          <w:bCs/>
+        </w:rPr>
+        <w:t>Successful login redirects to dashboard displaying user name</w:t>
+      </w:r>
+    </w:p>
+    <w:p>
+      <w:pPr>
+        <w:rPr>
+          <w:bCs/>
+        </w:rPr>
+      </w:pPr>
+      <w:r>
+        <w:rPr>
+          <w:bCs/>
+        </w:rPr>
+        <w:drawing>
+          <wp:inline distT="0" distB="0" distL="0" distR="0" wp14:anchorId="42D9A0BE" wp14:editId="313D72C8">
+            <wp:extent cx="5943600" cy="1776095"/>
+            <wp:effectExtent l="0" t="0" r="0" b="0"/>
+            <wp:docPr id="746871435" name="Picture 1"/>
+            <wp:cNvGraphicFramePr>
+              <a:graphicFrameLocks xmlns:a="http://schemas.openxmlformats.org/drawingml/2006/main" noChangeAspect="1"/>
+            </wp:cNvGraphicFramePr>
+            <a:graphic xmlns:a="http://schemas.openxmlformats.org/drawingml/2006/main">
+              <a:graphicData uri="http://schemas.openxmlformats.org/drawingml/2006/picture">
+                <pic:pic xmlns:pic="http://schemas.openxmlformats.org/drawingml/2006/picture">
+                  <pic:nvPicPr>
+                    <pic:cNvPr id="746871435" name=""/>
+                    <pic:cNvPicPr/>
+                  </pic:nvPicPr>
+                  <pic:blipFill>
+                    <a:blip r:embed="rId41"/>
+                    <a:stretch>
+                      <a:fillRect/>
+                    </a:stretch>
+                  </pic:blipFill>
+                  <pic:spPr>
+                    <a:xfrm>
+                      <a:off x="0" y="0"/>
+                      <a:ext cx="5943600" cy="1776095"/>
+                    </a:xfrm>
+                    <a:prstGeom prst="rect">
+                      <a:avLst/>
+                    </a:prstGeom>
+                  </pic:spPr>
+                </pic:pic>
+              </a:graphicData>
+            </a:graphic>
+          </wp:inline>
+        </w:drawing>
+      </w:r>
+    </w:p>
+    <w:p>
+      <w:pPr>
+        <w:rPr>
+          <w:bCs/>
+        </w:rPr>
+      </w:pPr>
+      <w:r>
+        <w:rPr>
+          <w:bCs/>
+        </w:rPr>
+        <w:lastRenderedPageBreak/>
+        <w:drawing>
+          <wp:inline distT="0" distB="0" distL="0" distR="0" wp14:anchorId="3F0D0586" wp14:editId="1BE57607">
+            <wp:extent cx="5943600" cy="1535430"/>
+            <wp:effectExtent l="0" t="0" r="0" b="7620"/>
+            <wp:docPr id="622457838" name="Picture 1"/>
+            <wp:cNvGraphicFramePr>
+              <a:graphicFrameLocks xmlns:a="http://schemas.openxmlformats.org/drawingml/2006/main" noChangeAspect="1"/>
+            </wp:cNvGraphicFramePr>
+            <a:graphic xmlns:a="http://schemas.openxmlformats.org/drawingml/2006/main">
+              <a:graphicData uri="http://schemas.openxmlformats.org/drawingml/2006/picture">
+                <pic:pic xmlns:pic="http://schemas.openxmlformats.org/drawingml/2006/picture">
+                  <pic:nvPicPr>
+                    <pic:cNvPr id="622457838" name=""/>
+                    <pic:cNvPicPr/>
+                  </pic:nvPicPr>
+                  <pic:blipFill>
+                    <a:blip r:embed="rId42"/>
+                    <a:stretch>
+                      <a:fillRect/>
+                    </a:stretch>
+                  </pic:blipFill>
+                  <pic:spPr>
+                    <a:xfrm>
+                      <a:off x="0" y="0"/>
+                      <a:ext cx="5943600" cy="1535430"/>
+                    </a:xfrm>
+                    <a:prstGeom prst="rect">
+                      <a:avLst/>
+                    </a:prstGeom>
+                  </pic:spPr>
+                </pic:pic>
+              </a:graphicData>
+            </a:graphic>
+          </wp:inline>
+        </w:drawing>
+      </w:r>
+    </w:p>
+    <w:p>
+      <w:pPr>
+        <w:pStyle w:val="ListParagraph"/>
+        <w:numPr>
+          <w:ilvl w:val="0"/>
+          <w:numId w:val="2"/>
+        </w:numPr>
+        <w:rPr>
+          <w:bCs/>
+        </w:rPr>
+      </w:pPr>
+      <w:r>
+        <w:rPr>
+          <w:bCs/>
+        </w:rPr>
+        <w:t>Logging out redirects to /login and deletes local storage user details</w:t>
+      </w:r>
+    </w:p>
+    <w:p>
+      <w:pPr>
+        <w:rPr>
+          <w:bCs/>
+        </w:rPr>
+      </w:pPr>
+      <w:r>
+        <w:rPr>
+          <w:bCs/>
+        </w:rPr>
+        <w:drawing>
+          <wp:inline distT="0" distB="0" distL="0" distR="0" wp14:anchorId="2B37865E" wp14:editId="1F9E6A81">
+            <wp:extent cx="5943600" cy="2894330"/>
+            <wp:effectExtent l="0" t="0" r="0" b="1270"/>
+            <wp:docPr id="1829861869" name="Picture 1"/>
+            <wp:cNvGraphicFramePr>
+              <a:graphicFrameLocks xmlns:a="http://schemas.openxmlformats.org/drawingml/2006/main" noChangeAspect="1"/>
+            </wp:cNvGraphicFramePr>
+            <a:graphic xmlns:a="http://schemas.openxmlformats.org/drawingml/2006/main">
+              <a:graphicData uri="http://schemas.openxmlformats.org/drawingml/2006/picture">
+                <pic:pic xmlns:pic="http://schemas.openxmlformats.org/drawingml/2006/picture">
+                  <pic:nvPicPr>
+                    <pic:cNvPr id="1829861869" name=""/>
+                    <pic:cNvPicPr/>
+                  </pic:nvPicPr>
+                  <pic:blipFill>
+                    <a:blip r:embed="rId43"/>
+                    <a:stretch>
+                      <a:fillRect/>
+                    </a:stretch>
+                  </pic:blipFill>
+                  <pic:spPr>
+                    <a:xfrm>
+                      <a:off x="0" y="0"/>
+                      <a:ext cx="5943600" cy="2894330"/>
+                    </a:xfrm>
+                    <a:prstGeom prst="rect">
+                      <a:avLst/>
+                    </a:prstGeom>
+                  </pic:spPr>
+                </pic:pic>
+              </a:graphicData>
+            </a:graphic>
+          </wp:inline>
+        </w:drawing>
+      </w:r>
+    </w:p>
+    <w:p>
+      <w:pPr>
+        <w:rPr>
+          <w:bCs/>
+        </w:rPr>
+      </w:pPr>
     </w:p>
     <w:sectPr>
       <w:pgSz w:w="12240" w:h="15840"/>

</xml_diff>